<commit_message>
Release QS (Rev. 02) and CQAD (Rev. 00) training manuals
Status changed from DRAFT FOR APPROVAL to RELEASED, effective 16 Oct 2026,
in EN and bilingual EN/VI editions; revision history updated. [TBC] items
remain open for the next revision; signature blocks left for sign-off.

Co-Authored-By: Claude Opus 5.5 <noreply@anthropic.com>
Claude-Session: https://claude.ai/code/session_011KC3NwuhUa3muSLWD4tvxq
</commit_message>
<xml_diff>
--- a/training/CQAD-Onboarding-Training-Manual.docx
+++ b/training/CQAD-Onboarding-Training-Manual.docx
@@ -214,7 +214,7 @@
                 <w:sz w:val="18"/>
                 <w:szCs w:val="18"/>
               </w:rPr>
-              <w:t xml:space="preserve">00 — draft for approval</w:t>
+              <w:t xml:space="preserve">00 — released</w:t>
             </w:r>
           </w:p>
         </w:tc>
@@ -486,7 +486,7 @@
                 <w:sz w:val="18"/>
                 <w:szCs w:val="18"/>
               </w:rPr>
-              <w:t xml:space="preserve">DRAFT FOR APPROVAL</w:t>
+              <w:t xml:space="preserve">RELEASED — effective 16 October 2026</w:t>
             </w:r>
           </w:p>
         </w:tc>
@@ -1460,6 +1460,135 @@
               <w:bottom w:val="single" w:color="BFBFBF" w:sz="4"/>
               <w:right w:val="single" w:color="BFBFBF" w:sz="4"/>
             </w:tcBorders>
+            <w:tcMar>
+              <w:top w:type="dxa" w:w="60"/>
+              <w:left w:type="dxa" w:w="100"/>
+              <w:bottom w:type="dxa" w:w="60"/>
+              <w:right w:type="dxa" w:w="100"/>
+            </w:tcMar>
+            <w:vAlign w:val="top"/>
+          </w:tcPr>
+          <w:p>
+            <w:pPr>
+              <w:spacing w:after="40"/>
+            </w:pPr>
+            <w:r>
+              <w:rPr>
+                <w:sz w:val="18"/>
+                <w:szCs w:val="18"/>
+              </w:rPr>
+              <w:t xml:space="preserve">CQAD office</w:t>
+            </w:r>
+          </w:p>
+        </w:tc>
+      </w:tr>
+      <w:tr>
+        <w:trPr>
+          <w:cantSplit/>
+        </w:trPr>
+        <w:tc>
+          <w:tcPr>
+            <w:tcW w:type="dxa" w:w="800"/>
+            <w:tcBorders>
+              <w:top w:val="single" w:color="BFBFBF" w:sz="4"/>
+              <w:left w:val="single" w:color="BFBFBF" w:sz="4"/>
+              <w:bottom w:val="single" w:color="BFBFBF" w:sz="4"/>
+              <w:right w:val="single" w:color="BFBFBF" w:sz="4"/>
+            </w:tcBorders>
+            <w:shd w:fill="F5F7FA" w:color="auto" w:val="clear"/>
+            <w:tcMar>
+              <w:top w:type="dxa" w:w="60"/>
+              <w:left w:type="dxa" w:w="100"/>
+              <w:bottom w:type="dxa" w:w="60"/>
+              <w:right w:type="dxa" w:w="100"/>
+            </w:tcMar>
+            <w:vAlign w:val="top"/>
+          </w:tcPr>
+          <w:p>
+            <w:pPr>
+              <w:spacing w:after="40"/>
+            </w:pPr>
+            <w:r>
+              <w:rPr>
+                <w:sz w:val="18"/>
+                <w:szCs w:val="18"/>
+              </w:rPr>
+              <w:t xml:space="preserve">00</w:t>
+            </w:r>
+          </w:p>
+        </w:tc>
+        <w:tc>
+          <w:tcPr>
+            <w:tcW w:type="dxa" w:w="1400"/>
+            <w:tcBorders>
+              <w:top w:val="single" w:color="BFBFBF" w:sz="4"/>
+              <w:left w:val="single" w:color="BFBFBF" w:sz="4"/>
+              <w:bottom w:val="single" w:color="BFBFBF" w:sz="4"/>
+              <w:right w:val="single" w:color="BFBFBF" w:sz="4"/>
+            </w:tcBorders>
+            <w:shd w:fill="F5F7FA" w:color="auto" w:val="clear"/>
+            <w:tcMar>
+              <w:top w:type="dxa" w:w="60"/>
+              <w:left w:type="dxa" w:w="100"/>
+              <w:bottom w:type="dxa" w:w="60"/>
+              <w:right w:type="dxa" w:w="100"/>
+            </w:tcMar>
+            <w:vAlign w:val="top"/>
+          </w:tcPr>
+          <w:p>
+            <w:pPr>
+              <w:spacing w:after="40"/>
+            </w:pPr>
+            <w:r>
+              <w:rPr>
+                <w:sz w:val="18"/>
+                <w:szCs w:val="18"/>
+              </w:rPr>
+              <w:t xml:space="preserve">2026-10-16</w:t>
+            </w:r>
+          </w:p>
+        </w:tc>
+        <w:tc>
+          <w:tcPr>
+            <w:tcW w:type="dxa" w:w="5638"/>
+            <w:tcBorders>
+              <w:top w:val="single" w:color="BFBFBF" w:sz="4"/>
+              <w:left w:val="single" w:color="BFBFBF" w:sz="4"/>
+              <w:bottom w:val="single" w:color="BFBFBF" w:sz="4"/>
+              <w:right w:val="single" w:color="BFBFBF" w:sz="4"/>
+            </w:tcBorders>
+            <w:shd w:fill="F5F7FA" w:color="auto" w:val="clear"/>
+            <w:tcMar>
+              <w:top w:type="dxa" w:w="60"/>
+              <w:left w:type="dxa" w:w="100"/>
+              <w:bottom w:type="dxa" w:w="60"/>
+              <w:right w:type="dxa" w:w="100"/>
+            </w:tcMar>
+            <w:vAlign w:val="top"/>
+          </w:tcPr>
+          <w:p>
+            <w:pPr>
+              <w:spacing w:after="40"/>
+            </w:pPr>
+            <w:r>
+              <w:rPr>
+                <w:sz w:val="18"/>
+                <w:szCs w:val="18"/>
+              </w:rPr>
+              <w:t xml:space="preserve">Released for use, effective 16 Oct 2026. [TBC] items to be completed at the next revision.</w:t>
+            </w:r>
+          </w:p>
+        </w:tc>
+        <w:tc>
+          <w:tcPr>
+            <w:tcW w:type="dxa" w:w="1800"/>
+            <w:tcBorders>
+              <w:top w:val="single" w:color="BFBFBF" w:sz="4"/>
+              <w:left w:val="single" w:color="BFBFBF" w:sz="4"/>
+              <w:bottom w:val="single" w:color="BFBFBF" w:sz="4"/>
+              <w:right w:val="single" w:color="BFBFBF" w:sz="4"/>
+            </w:tcBorders>
+            <w:shd w:fill="F5F7FA" w:color="auto" w:val="clear"/>
             <w:tcMar>
               <w:top w:type="dxa" w:w="60"/>
               <w:left w:type="dxa" w:w="100"/>

</xml_diff>